<commit_message>
feat(studio): complete S1.5 run state and reconnect reliability
</commit_message>
<xml_diff>
--- a/docs/Auto-Tune后续研发路线与实施评估_研发执行版_20260824.docx
+++ b/docs/Auto-Tune后续研发路线与实施评估_研发执行版_20260824.docx
@@ -222,15 +222,15 @@
           </w:tcPr>
           <w:p>
             <w:pPr>
-              <w:spacing w:after="0" w:line="252" w:lineRule="auto"/>
-            </w:pPr>
-            <w:r>
-              <w:rPr>
-                <w:rFonts w:ascii="Microsoft YaHei" w:hAnsi="Microsoft YaHei" w:eastAsia="Microsoft YaHei"/>
-                <w:color w:val="1F1F1F"/>
+              <w:spacing w:after="0"/>
+            </w:pPr>
+            <w:r>
+              <w:rPr>
+                <w:rFonts w:ascii="Microsoft YaHei" w:hAnsi="Microsoft YaHei" w:eastAsia="Microsoft YaHei"/>
+                <w:b w:val="0"/>
                 <w:sz w:val="18"/>
               </w:rPr>
-              <w:t>Auto-Tune Studio v0.2；S1.2/S1.3通过PR #4合并main；S1.4通过PR #5合并main</w:t>
+              <w:t>Auto-Tune Studio v0.2；S1.2/S1.3 已通过 PR #4 合并 main；S1.4 已通过 PR #5 合并 main；S1.5 已验收待提交</w:t>
             </w:r>
           </w:p>
         </w:tc>
@@ -277,15 +277,15 @@
           </w:tcPr>
           <w:p>
             <w:pPr>
-              <w:spacing w:after="0" w:line="252" w:lineRule="auto"/>
-            </w:pPr>
-            <w:r>
-              <w:rPr>
-                <w:rFonts w:ascii="Microsoft YaHei" w:hAnsi="Microsoft YaHei" w:eastAsia="Microsoft YaHei"/>
-                <w:color w:val="1F1F1F"/>
+              <w:spacing w:after="0"/>
+            </w:pPr>
+            <w:r>
+              <w:rPr>
+                <w:rFonts w:ascii="Microsoft YaHei" w:hAnsi="Microsoft YaHei" w:eastAsia="Microsoft YaHei"/>
+                <w:b w:val="0"/>
                 <w:sz w:val="18"/>
               </w:rPr>
-              <w:t>460 passed，2条既有 sklearn PCA warning；S1.4 Chromium目录安全验收通过</w:t>
+              <w:t>546 passed，2 条既有 sklearn PCA warning；S1.5 真实断线、刷新重连与停止竞态验收通过</w:t>
             </w:r>
           </w:p>
         </w:tc>
@@ -334,15 +334,15 @@
           </w:tcPr>
           <w:p>
             <w:pPr>
-              <w:spacing w:after="0" w:line="252" w:lineRule="auto"/>
-            </w:pPr>
-            <w:r>
-              <w:rPr>
-                <w:rFonts w:ascii="Microsoft YaHei" w:hAnsi="Microsoft YaHei" w:eastAsia="Microsoft YaHei"/>
-                <w:color w:val="1F1F1F"/>
+              <w:spacing w:after="0"/>
+            </w:pPr>
+            <w:r>
+              <w:rPr>
+                <w:rFonts w:ascii="Microsoft YaHei" w:hAnsi="Microsoft YaHei" w:eastAsia="Microsoft YaHei"/>
+                <w:b w:val="0"/>
                 <w:sz w:val="18"/>
               </w:rPr>
-              <w:t>S1.4目录输入安全完成验收；遗留ZIP/JSON上传固定410，不再建设ZIP安全提取</w:t>
+              <w:t>S1.5 运行状态与重连可靠性完成验收；下一批进入 S2.1 SQLite 本地存储基础</w:t>
             </w:r>
           </w:p>
         </w:tc>
@@ -389,15 +389,15 @@
           </w:tcPr>
           <w:p>
             <w:pPr>
-              <w:spacing w:after="0" w:line="252" w:lineRule="auto"/>
-            </w:pPr>
-            <w:r>
-              <w:rPr>
-                <w:rFonts w:ascii="Microsoft YaHei" w:hAnsi="Microsoft YaHei" w:eastAsia="Microsoft YaHei"/>
-                <w:color w:val="1F1F1F"/>
+              <w:spacing w:after="0"/>
+            </w:pPr>
+            <w:r>
+              <w:rPr>
+                <w:rFonts w:ascii="Microsoft YaHei" w:hAnsi="Microsoft YaHei" w:eastAsia="Microsoft YaHei"/>
+                <w:b w:val="0"/>
                 <w:sz w:val="18"/>
               </w:rPr>
-              <w:t>2026-08-24</w:t>
+              <w:t>2026-08-26</w:t>
             </w:r>
           </w:p>
         </w:tc>
@@ -444,6 +444,7 @@
               <w:bottom w:w="140" w:type="dxa"/>
               <w:end w:w="180" w:type="dxa"/>
             </w:tcMar>
+            <w:vAlign w:val="center"/>
           </w:tcPr>
           <w:p>
             <w:pPr>
@@ -453,18 +454,9 @@
               <w:rPr>
                 <w:rFonts w:ascii="Microsoft YaHei" w:hAnsi="Microsoft YaHei" w:eastAsia="Microsoft YaHei"/>
                 <w:b/>
-                <w:color w:val="17365D"/>
-                <w:sz w:val="21"/>
-              </w:rPr>
-              <w:t>执行结论：</w:t>
-            </w:r>
-            <w:r>
-              <w:rPr>
-                <w:rFonts w:ascii="Microsoft YaHei" w:hAnsi="Microsoft YaHei" w:eastAsia="Microsoft YaHei"/>
-                <w:color w:val="1F1F1F"/>
-                <w:sz w:val="21"/>
-              </w:rPr>
-              <w:t>Studio S1.2与S1.3已通过PR #4合并main；S1.4目录输入安全已通过PR #5合并main。当前稳定Release仍为v0.2。下一批先完成统一的Studio S1.5运行状态与重连可靠性，再进入S2 SQLite与多数据集；Research与Cloud继续保持后置边界。</w:t>
+                <w:sz w:val="18"/>
+              </w:rPr>
+              <w:t>执行结论：Studio S1.2 与 S1.3 已通过 PR #4 合并 main；S1.4 已通过 PR #5 合并 main；S1.5 运行状态与重连可靠性已于 2026-08-26 完成独立验收，当前稳定 Release 仍为 v0.2。下一批进入 S2.1 SQLite 本地存储基础，再依次推进数据集索引、实验迁移和 UI 对比归档；Research 与 Cloud 继续保持后置边界。</w:t>
             </w:r>
           </w:p>
         </w:tc>
@@ -2396,15 +2388,15 @@
           </w:tcPr>
           <w:p>
             <w:pPr>
-              <w:spacing w:after="0" w:line="252" w:lineRule="auto"/>
-            </w:pPr>
-            <w:r>
-              <w:rPr>
-                <w:rFonts w:ascii="Microsoft YaHei" w:hAnsi="Microsoft YaHei" w:eastAsia="Microsoft YaHei"/>
-                <w:color w:val="1F1F1F"/>
-                <w:sz w:val="16"/>
-              </w:rPr>
-              <w:t>下一批/统一交付</w:t>
+              <w:spacing w:after="0"/>
+            </w:pPr>
+            <w:r>
+              <w:rPr>
+                <w:rFonts w:ascii="Microsoft YaHei" w:hAnsi="Microsoft YaHei" w:eastAsia="Microsoft YaHei"/>
+                <w:b w:val="0"/>
+                <w:sz w:val="18"/>
+              </w:rPr>
+              <w:t>已完成/待提交</w:t>
             </w:r>
           </w:p>
         </w:tc>
@@ -2421,15 +2413,15 @@
           </w:tcPr>
           <w:p>
             <w:pPr>
-              <w:spacing w:after="0" w:line="252" w:lineRule="auto"/>
-            </w:pPr>
-            <w:r>
-              <w:rPr>
-                <w:rFonts w:ascii="Microsoft YaHei" w:hAnsi="Microsoft YaHei" w:eastAsia="Microsoft YaHei"/>
-                <w:color w:val="1F1F1F"/>
-                <w:sz w:val="16"/>
-              </w:rPr>
-              <w:t>统一普通训练与调优的运行身份和状态；PID校验；阶段/最后事件原子持久化；API、SSE、UI刷新重连</w:t>
+              <w:spacing w:after="0"/>
+            </w:pPr>
+            <w:r>
+              <w:rPr>
+                <w:rFonts w:ascii="Microsoft YaHei" w:hAnsi="Microsoft YaHei" w:eastAsia="Microsoft YaHei"/>
+                <w:b w:val="0"/>
+                <w:sz w:val="18"/>
+              </w:rPr>
+              <w:t>统一运行身份和状态 Schema；PID 创建身份校验；后台控制器与 SSE 解耦；有界事件重放；API、SSE、UI 六态刷新重连</w:t>
             </w:r>
           </w:p>
         </w:tc>
@@ -2446,15 +2438,15 @@
           </w:tcPr>
           <w:p>
             <w:pPr>
-              <w:spacing w:after="0" w:line="252" w:lineRule="auto"/>
-            </w:pPr>
-            <w:r>
-              <w:rPr>
-                <w:rFonts w:ascii="Microsoft YaHei" w:hAnsi="Microsoft YaHei" w:eastAsia="Microsoft YaHei"/>
-                <w:color w:val="1F1F1F"/>
-                <w:sz w:val="16"/>
-              </w:rPr>
-              <w:t>旧状态可读；PID复用不误判；异常消失标记中断/未知；不伪造恢复</w:t>
+              <w:spacing w:after="0"/>
+            </w:pPr>
+            <w:r>
+              <w:rPr>
+                <w:rFonts w:ascii="Microsoft YaHei" w:hAnsi="Microsoft YaHei" w:eastAsia="Microsoft YaHei"/>
+                <w:b w:val="0"/>
+                <w:sz w:val="18"/>
+              </w:rPr>
+              <w:t>28 项边界测试、84 项 S1.5 聚合、546 项完整测试通过；真实断线后后台继续并写入真实终态；不伪造恢复</w:t>
             </w:r>
           </w:p>
         </w:tc>
@@ -2655,15 +2647,15 @@
           </w:tcPr>
           <w:p>
             <w:pPr>
-              <w:spacing w:after="0" w:line="252" w:lineRule="auto"/>
-            </w:pPr>
-            <w:r>
-              <w:rPr>
-                <w:rFonts w:ascii="Microsoft YaHei" w:hAnsi="Microsoft YaHei" w:eastAsia="Microsoft YaHei"/>
-                <w:color w:val="1F1F1F"/>
-                <w:sz w:val="16"/>
-              </w:rPr>
-              <w:t>普通训练与自动调优共用版本化运行身份、状态Schema和原子写入；兼容读取旧状态</w:t>
+              <w:spacing w:after="0"/>
+            </w:pPr>
+            <w:r>
+              <w:rPr>
+                <w:rFonts w:ascii="Microsoft YaHei" w:hAnsi="Microsoft YaHei" w:eastAsia="Microsoft YaHei"/>
+                <w:b w:val="0"/>
+                <w:sz w:val="18"/>
+              </w:rPr>
+              <w:t>普通训练与自动调优共用 Schema 1.0、唯一 run_id 与原子状态写入；兼容旧状态和损坏文件的保守投影</w:t>
             </w:r>
           </w:p>
         </w:tc>
@@ -2737,15 +2729,15 @@
           </w:tcPr>
           <w:p>
             <w:pPr>
-              <w:spacing w:after="0" w:line="252" w:lineRule="auto"/>
-            </w:pPr>
-            <w:r>
-              <w:rPr>
-                <w:rFonts w:ascii="Microsoft YaHei" w:hAnsi="Microsoft YaHei" w:eastAsia="Microsoft YaHei"/>
-                <w:color w:val="1F1F1F"/>
-                <w:sz w:val="16"/>
-              </w:rPr>
-              <w:t>记录PID及进程身份、启动时间、阶段、最后事件序号/时间和终态；服务启动与查询时复核</w:t>
+              <w:spacing w:after="0"/>
+            </w:pPr>
+            <w:r>
+              <w:rPr>
+                <w:rFonts w:ascii="Microsoft YaHei" w:hAnsi="Microsoft YaHei" w:eastAsia="Microsoft YaHei"/>
+                <w:b w:val="0"/>
+                <w:sz w:val="18"/>
+              </w:rPr>
+              <w:t>记录 PID 创建身份、阶段与最后事件；服务重启后不重新接管进程，按事实降级为 interrupted 或 unknown</w:t>
             </w:r>
           </w:p>
         </w:tc>
@@ -2818,15 +2810,15 @@
           </w:tcPr>
           <w:p>
             <w:pPr>
-              <w:spacing w:after="0" w:line="252" w:lineRule="auto"/>
-            </w:pPr>
-            <w:r>
-              <w:rPr>
-                <w:rFonts w:ascii="Microsoft YaHei" w:hAnsi="Microsoft YaHei" w:eastAsia="Microsoft YaHei"/>
-                <w:color w:val="1F1F1F"/>
-                <w:sz w:val="16"/>
-              </w:rPr>
-              <w:t>API返回统一状态；SSE按最后事件位置续读可用日志/事件；UI刷新后展示运行、完成、失败、中断或未知</w:t>
+              <w:spacing w:after="0"/>
+            </w:pPr>
+            <w:r>
+              <w:rPr>
+                <w:rFonts w:ascii="Microsoft YaHei" w:hAnsi="Microsoft YaHei" w:eastAsia="Microsoft YaHei"/>
+                <w:b w:val="0"/>
+                <w:sz w:val="18"/>
+              </w:rPr>
+              <w:t>后台控制器独立于 SSE；每运行保留最近 2000 条事件，已完成控制器最多保留 20 个、TTL 30 分钟；按 after_seq 重连</w:t>
             </w:r>
           </w:p>
         </w:tc>
@@ -2843,15 +2835,15 @@
           </w:tcPr>
           <w:p>
             <w:pPr>
-              <w:spacing w:after="0" w:line="252" w:lineRule="auto"/>
-            </w:pPr>
-            <w:r>
-              <w:rPr>
-                <w:rFonts w:ascii="Microsoft YaHei" w:hAnsi="Microsoft YaHei" w:eastAsia="Microsoft YaHei"/>
-                <w:color w:val="1F1F1F"/>
-                <w:sz w:val="16"/>
-              </w:rPr>
-              <w:t>按钮与状态一致；不把状态展示描述成重新接管进程或断点续训</w:t>
+              <w:spacing w:after="0"/>
+            </w:pPr>
+            <w:r>
+              <w:rPr>
+                <w:rFonts w:ascii="Microsoft YaHei" w:hAnsi="Microsoft YaHei" w:eastAsia="Microsoft YaHei"/>
+                <w:b w:val="0"/>
+                <w:sz w:val="18"/>
+              </w:rPr>
+              <w:t>刷新/切页不停止任务；断线期间事件可在保留期补发；缓冲缺口明确提示；不声称断点续训或恢复进程</w:t>
             </w:r>
           </w:p>
         </w:tc>
@@ -3157,15 +3149,15 @@
           </w:tcPr>
           <w:p>
             <w:pPr>
-              <w:spacing w:after="0" w:line="252" w:lineRule="auto"/>
-            </w:pPr>
-            <w:r>
-              <w:rPr>
-                <w:rFonts w:ascii="Microsoft YaHei" w:hAnsi="Microsoft YaHei" w:eastAsia="Microsoft YaHei"/>
-                <w:color w:val="1F1F1F"/>
-                <w:sz w:val="16"/>
-              </w:rPr>
-              <w:t>S1.5后</w:t>
+              <w:spacing w:after="0"/>
+            </w:pPr>
+            <w:r>
+              <w:rPr>
+                <w:rFonts w:ascii="Microsoft YaHei" w:hAnsi="Microsoft YaHei" w:eastAsia="Microsoft YaHei"/>
+                <w:b w:val="0"/>
+                <w:sz w:val="18"/>
+              </w:rPr>
+              <w:t>下一批</w:t>
             </w:r>
           </w:p>
         </w:tc>
@@ -11083,15 +11075,15 @@
           </w:tcPr>
           <w:p>
             <w:pPr>
-              <w:spacing w:after="0" w:line="252" w:lineRule="auto"/>
-            </w:pPr>
-            <w:r>
-              <w:rPr>
-                <w:rFonts w:ascii="Microsoft YaHei" w:hAnsi="Microsoft YaHei" w:eastAsia="Microsoft YaHei"/>
-                <w:color w:val="1F1F1F"/>
-                <w:sz w:val="16"/>
-              </w:rPr>
-              <w:t>统一运行身份、PID/阶段/最后事件持久化及API/SSE/UI重连</w:t>
+              <w:spacing w:after="0"/>
+            </w:pPr>
+            <w:r>
+              <w:rPr>
+                <w:rFonts w:ascii="Microsoft YaHei" w:hAnsi="Microsoft YaHei" w:eastAsia="Microsoft YaHei"/>
+                <w:b w:val="0"/>
+                <w:sz w:val="18"/>
+              </w:rPr>
+              <w:t>已完成独立验收：统一身份/PID/阶段/最后事件；后台控制器；有界重放；API/SSE/UI 六态重连</w:t>
             </w:r>
           </w:p>
         </w:tc>
@@ -11108,15 +11100,15 @@
           </w:tcPr>
           <w:p>
             <w:pPr>
-              <w:spacing w:after="0" w:line="252" w:lineRule="auto"/>
-            </w:pPr>
-            <w:r>
-              <w:rPr>
-                <w:rFonts w:ascii="Microsoft YaHei" w:hAnsi="Microsoft YaHei" w:eastAsia="Microsoft YaHei"/>
-                <w:color w:val="1F1F1F"/>
-                <w:sz w:val="16"/>
-              </w:rPr>
-              <w:t>统一批次验收；不误判PID，不伪造恢复</w:t>
+              <w:spacing w:after="0"/>
+            </w:pPr>
+            <w:r>
+              <w:rPr>
+                <w:rFonts w:ascii="Microsoft YaHei" w:hAnsi="Microsoft YaHei" w:eastAsia="Microsoft YaHei"/>
+                <w:b w:val="0"/>
+                <w:sz w:val="18"/>
+              </w:rPr>
+              <w:t>保持兼容边界并完成提交；不得误判 PID、伪造恢复或让 SSE 断开终止训练</w:t>
             </w:r>
           </w:p>
         </w:tc>
@@ -11191,15 +11183,15 @@
           </w:tcPr>
           <w:p>
             <w:pPr>
-              <w:spacing w:after="0" w:line="252" w:lineRule="auto"/>
-            </w:pPr>
-            <w:r>
-              <w:rPr>
-                <w:rFonts w:ascii="Microsoft YaHei" w:hAnsi="Microsoft YaHei" w:eastAsia="Microsoft YaHei"/>
-                <w:color w:val="1F1F1F"/>
-                <w:sz w:val="16"/>
-              </w:rPr>
-              <w:t>S2.1–S2.4：存储基础、数据集索引、实验迁移、UI对比归档</w:t>
+              <w:spacing w:after="0"/>
+            </w:pPr>
+            <w:r>
+              <w:rPr>
+                <w:rFonts w:ascii="Microsoft YaHei" w:hAnsi="Microsoft YaHei" w:eastAsia="Microsoft YaHei"/>
+                <w:b w:val="0"/>
+                <w:sz w:val="18"/>
+              </w:rPr>
+              <w:t>下一批从 S2.1 存储基础开始，再推进数据集索引、实验迁移和 UI 对比归档</w:t>
             </w:r>
           </w:p>
         </w:tc>
@@ -14952,6 +14944,439 @@
       <w:pPr>
         <w:spacing w:after="20"/>
       </w:pPr>
+    </w:p>
+    <w:p>
+      <w:pPr>
+        <w:pStyle w:val="Heading1"/>
+        <w:spacing w:after="120"/>
+      </w:pPr>
+      <w:r>
+        <w:rPr>
+          <w:rFonts w:ascii="Microsoft YaHei" w:hAnsi="Microsoft YaHei" w:eastAsia="Microsoft YaHei"/>
+        </w:rPr>
+        <w:t>14. Studio S1.5 完成记录（2026-08-26）</w:t>
+      </w:r>
+    </w:p>
+    <w:tbl>
+      <w:tblPr>
+        <w:tblW w:type="auto" w:w="0"/>
+        <w:tblLook w:firstColumn="1" w:firstRow="1" w:lastColumn="0" w:lastRow="0" w:noHBand="0" w:noVBand="1" w:val="04A0"/>
+      </w:tblPr>
+      <w:tblGrid>
+        <w:gridCol w:w="4939"/>
+        <w:gridCol w:w="4939"/>
+      </w:tblGrid>
+      <w:tr>
+        <w:tc>
+          <w:tcPr>
+            <w:tcW w:type="dxa" w:w="4939"/>
+            <w:vAlign w:val="center"/>
+          </w:tcPr>
+          <w:p>
+            <w:pPr>
+              <w:spacing w:after="0"/>
+            </w:pPr>
+            <w:r>
+              <w:rPr>
+                <w:rFonts w:ascii="Microsoft YaHei" w:hAnsi="Microsoft YaHei" w:eastAsia="Microsoft YaHei"/>
+                <w:b/>
+                <w:sz w:val="18"/>
+              </w:rPr>
+              <w:t>项目</w:t>
+            </w:r>
+          </w:p>
+        </w:tc>
+        <w:tc>
+          <w:tcPr>
+            <w:tcW w:type="dxa" w:w="4939"/>
+            <w:vAlign w:val="center"/>
+          </w:tcPr>
+          <w:p>
+            <w:pPr>
+              <w:spacing w:after="0"/>
+            </w:pPr>
+            <w:r>
+              <w:rPr>
+                <w:rFonts w:ascii="Microsoft YaHei" w:hAnsi="Microsoft YaHei" w:eastAsia="Microsoft YaHei"/>
+                <w:b/>
+                <w:sz w:val="18"/>
+              </w:rPr>
+              <w:t>实际结果</w:t>
+            </w:r>
+          </w:p>
+        </w:tc>
+      </w:tr>
+      <w:tr>
+        <w:tc>
+          <w:tcPr>
+            <w:tcW w:type="dxa" w:w="4939"/>
+            <w:vAlign w:val="center"/>
+          </w:tcPr>
+          <w:p>
+            <w:pPr>
+              <w:spacing w:after="0"/>
+            </w:pPr>
+            <w:r>
+              <w:rPr>
+                <w:rFonts w:ascii="Microsoft YaHei" w:hAnsi="Microsoft YaHei" w:eastAsia="Microsoft YaHei"/>
+                <w:b/>
+                <w:sz w:val="18"/>
+              </w:rPr>
+              <w:t>运行状态</w:t>
+            </w:r>
+          </w:p>
+        </w:tc>
+        <w:tc>
+          <w:tcPr>
+            <w:tcW w:type="dxa" w:w="4939"/>
+            <w:vAlign w:val="center"/>
+          </w:tcPr>
+          <w:p>
+            <w:pPr>
+              <w:spacing w:after="0"/>
+            </w:pPr>
+            <w:r>
+              <w:rPr>
+                <w:rFonts w:ascii="Microsoft YaHei" w:hAnsi="Microsoft YaHei" w:eastAsia="Microsoft YaHei"/>
+                <w:b w:val="0"/>
+                <w:sz w:val="18"/>
+              </w:rPr>
+              <w:t>普通训练与自动调优统一 Schema 1.0、唯一 run_id、阶段、PID 创建身份和最后事件；状态原子写入，旧格式继续可读。</w:t>
+            </w:r>
+          </w:p>
+        </w:tc>
+      </w:tr>
+      <w:tr>
+        <w:tc>
+          <w:tcPr>
+            <w:tcW w:type="dxa" w:w="4939"/>
+            <w:vAlign w:val="center"/>
+          </w:tcPr>
+          <w:p>
+            <w:pPr>
+              <w:spacing w:after="0"/>
+            </w:pPr>
+            <w:r>
+              <w:rPr>
+                <w:rFonts w:ascii="Microsoft YaHei" w:hAnsi="Microsoft YaHei" w:eastAsia="Microsoft YaHei"/>
+                <w:b/>
+                <w:sz w:val="18"/>
+              </w:rPr>
+              <w:t>执行解耦</w:t>
+            </w:r>
+          </w:p>
+        </w:tc>
+        <w:tc>
+          <w:tcPr>
+            <w:tcW w:type="dxa" w:w="4939"/>
+            <w:vAlign w:val="center"/>
+          </w:tcPr>
+          <w:p>
+            <w:pPr>
+              <w:spacing w:after="0"/>
+            </w:pPr>
+            <w:r>
+              <w:rPr>
+                <w:rFonts w:ascii="Microsoft YaHei" w:hAnsi="Microsoft YaHei" w:eastAsia="Microsoft YaHei"/>
+                <w:b w:val="0"/>
+                <w:sz w:val="18"/>
+              </w:rPr>
+              <w:t>ManualRunController 与 TuningRunController 独立拥有执行生命周期；SSE 仅订阅事件，刷新或断开不会停止后台任务。</w:t>
+            </w:r>
+          </w:p>
+        </w:tc>
+      </w:tr>
+      <w:tr>
+        <w:tc>
+          <w:tcPr>
+            <w:tcW w:type="dxa" w:w="4939"/>
+            <w:vAlign w:val="center"/>
+          </w:tcPr>
+          <w:p>
+            <w:pPr>
+              <w:spacing w:after="0"/>
+            </w:pPr>
+            <w:r>
+              <w:rPr>
+                <w:rFonts w:ascii="Microsoft YaHei" w:hAnsi="Microsoft YaHei" w:eastAsia="Microsoft YaHei"/>
+                <w:b/>
+                <w:sz w:val="18"/>
+              </w:rPr>
+              <w:t>重连与保留</w:t>
+            </w:r>
+          </w:p>
+        </w:tc>
+        <w:tc>
+          <w:tcPr>
+            <w:tcW w:type="dxa" w:w="4939"/>
+            <w:vAlign w:val="center"/>
+          </w:tcPr>
+          <w:p>
+            <w:pPr>
+              <w:spacing w:after="0"/>
+            </w:pPr>
+            <w:r>
+              <w:rPr>
+                <w:rFonts w:ascii="Microsoft YaHei" w:hAnsi="Microsoft YaHei" w:eastAsia="Microsoft YaHei"/>
+                <w:b w:val="0"/>
+                <w:sz w:val="18"/>
+              </w:rPr>
+              <w:t>EventBroker 每运行保留最近 2000 条事件；RunManager 最多保留 20 个完成控制器、TTL 30 分钟；按 after_seq 补发。</w:t>
+            </w:r>
+          </w:p>
+        </w:tc>
+      </w:tr>
+      <w:tr>
+        <w:tc>
+          <w:tcPr>
+            <w:tcW w:type="dxa" w:w="4939"/>
+            <w:vAlign w:val="center"/>
+          </w:tcPr>
+          <w:p>
+            <w:pPr>
+              <w:spacing w:after="0"/>
+            </w:pPr>
+            <w:r>
+              <w:rPr>
+                <w:rFonts w:ascii="Microsoft YaHei" w:hAnsi="Microsoft YaHei" w:eastAsia="Microsoft YaHei"/>
+                <w:b/>
+                <w:sz w:val="18"/>
+              </w:rPr>
+              <w:t>停止语义</w:t>
+            </w:r>
+          </w:p>
+        </w:tc>
+        <w:tc>
+          <w:tcPr>
+            <w:tcW w:type="dxa" w:w="4939"/>
+            <w:vAlign w:val="center"/>
+          </w:tcPr>
+          <w:p>
+            <w:pPr>
+              <w:spacing w:after="0"/>
+            </w:pPr>
+            <w:r>
+              <w:rPr>
+                <w:rFonts w:ascii="Microsoft YaHei" w:hAnsi="Microsoft YaHei" w:eastAsia="Microsoft YaHei"/>
+                <w:b w:val="0"/>
+                <w:sz w:val="18"/>
+              </w:rPr>
+              <w:t>覆盖启动前、创建中和运行中竞态；只有终止实际生效才写 cancelled，否则按真实退出码写 completed 或 failed。</w:t>
+            </w:r>
+          </w:p>
+        </w:tc>
+      </w:tr>
+      <w:tr>
+        <w:tc>
+          <w:tcPr>
+            <w:tcW w:type="dxa" w:w="4939"/>
+            <w:vAlign w:val="center"/>
+          </w:tcPr>
+          <w:p>
+            <w:pPr>
+              <w:spacing w:after="0"/>
+            </w:pPr>
+            <w:r>
+              <w:rPr>
+                <w:rFonts w:ascii="Microsoft YaHei" w:hAnsi="Microsoft YaHei" w:eastAsia="Microsoft YaHei"/>
+                <w:b/>
+                <w:sz w:val="18"/>
+              </w:rPr>
+              <w:t>安全边界</w:t>
+            </w:r>
+          </w:p>
+        </w:tc>
+        <w:tc>
+          <w:tcPr>
+            <w:tcW w:type="dxa" w:w="4939"/>
+            <w:vAlign w:val="center"/>
+          </w:tcPr>
+          <w:p>
+            <w:pPr>
+              <w:spacing w:after="0"/>
+            </w:pPr>
+            <w:r>
+              <w:rPr>
+                <w:rFonts w:ascii="Microsoft YaHei" w:hAnsi="Microsoft YaHei" w:eastAsia="Microsoft YaHei"/>
+                <w:b w:val="0"/>
+                <w:sz w:val="18"/>
+              </w:rPr>
+              <w:t>服务重启后不接管旧 PID，不实现断点续训；PID 消失、复用或不可验证时保守显示 interrupted/unknown。</w:t>
+            </w:r>
+          </w:p>
+        </w:tc>
+      </w:tr>
+      <w:tr>
+        <w:tc>
+          <w:tcPr>
+            <w:tcW w:type="dxa" w:w="4939"/>
+            <w:vAlign w:val="center"/>
+          </w:tcPr>
+          <w:p>
+            <w:pPr>
+              <w:spacing w:after="0"/>
+            </w:pPr>
+            <w:r>
+              <w:rPr>
+                <w:rFonts w:ascii="Microsoft YaHei" w:hAnsi="Microsoft YaHei" w:eastAsia="Microsoft YaHei"/>
+                <w:b/>
+                <w:sz w:val="18"/>
+              </w:rPr>
+              <w:t>自动化</w:t>
+            </w:r>
+          </w:p>
+        </w:tc>
+        <w:tc>
+          <w:tcPr>
+            <w:tcW w:type="dxa" w:w="4939"/>
+            <w:vAlign w:val="center"/>
+          </w:tcPr>
+          <w:p>
+            <w:pPr>
+              <w:spacing w:after="0"/>
+            </w:pPr>
+            <w:r>
+              <w:rPr>
+                <w:rFonts w:ascii="Microsoft YaHei" w:hAnsi="Microsoft YaHei" w:eastAsia="Microsoft YaHei"/>
+                <w:b w:val="0"/>
+                <w:sz w:val="18"/>
+              </w:rPr>
+              <w:t>最终边界定向 28 passed；S1.5 六文件聚合 84 passed；完整套件 546 passed、2 条既有 PCA warning、0 skipped。</w:t>
+            </w:r>
+          </w:p>
+        </w:tc>
+      </w:tr>
+      <w:tr>
+        <w:tc>
+          <w:tcPr>
+            <w:tcW w:type="dxa" w:w="4939"/>
+            <w:vAlign w:val="center"/>
+          </w:tcPr>
+          <w:p>
+            <w:pPr>
+              <w:spacing w:after="0"/>
+            </w:pPr>
+            <w:r>
+              <w:rPr>
+                <w:rFonts w:ascii="Microsoft YaHei" w:hAnsi="Microsoft YaHei" w:eastAsia="Microsoft YaHei"/>
+                <w:b/>
+                <w:sz w:val="18"/>
+              </w:rPr>
+              <w:t>真实验证</w:t>
+            </w:r>
+          </w:p>
+        </w:tc>
+        <w:tc>
+          <w:tcPr>
+            <w:tcW w:type="dxa" w:w="4939"/>
+            <w:vAlign w:val="center"/>
+          </w:tcPr>
+          <w:p>
+            <w:pPr>
+              <w:spacing w:after="0"/>
+            </w:pPr>
+            <w:r>
+              <w:rPr>
+                <w:rFonts w:ascii="Microsoft YaHei" w:hAnsi="Microsoft YaHei" w:eastAsia="Microsoft YaHei"/>
+                <w:b w:val="0"/>
+                <w:sz w:val="18"/>
+              </w:rPr>
+              <w:t>客户端断开后后台调优继续执行并持久化真实终态；浏览器刷新显示一致状态。</w:t>
+            </w:r>
+          </w:p>
+        </w:tc>
+      </w:tr>
+      <w:tr>
+        <w:tc>
+          <w:tcPr>
+            <w:tcW w:type="dxa" w:w="4939"/>
+            <w:vAlign w:val="center"/>
+          </w:tcPr>
+          <w:p>
+            <w:pPr>
+              <w:spacing w:after="0"/>
+            </w:pPr>
+            <w:r>
+              <w:rPr>
+                <w:rFonts w:ascii="Microsoft YaHei" w:hAnsi="Microsoft YaHei" w:eastAsia="Microsoft YaHei"/>
+                <w:b/>
+                <w:sz w:val="18"/>
+              </w:rPr>
+              <w:t>验收限制</w:t>
+            </w:r>
+          </w:p>
+        </w:tc>
+        <w:tc>
+          <w:tcPr>
+            <w:tcW w:type="dxa" w:w="4939"/>
+            <w:vAlign w:val="center"/>
+          </w:tcPr>
+          <w:p>
+            <w:pPr>
+              <w:spacing w:after="0"/>
+            </w:pPr>
+            <w:r>
+              <w:rPr>
+                <w:rFonts w:ascii="Microsoft YaHei" w:hAnsi="Microsoft YaHei" w:eastAsia="Microsoft YaHei"/>
+                <w:b w:val="0"/>
+                <w:sz w:val="18"/>
+              </w:rPr>
+              <w:t>当前登记的数据集快照损坏，未绕过 S1.2 门禁执行新短 epoch；后续真实训练前先重建并验证合法快照。</w:t>
+            </w:r>
+          </w:p>
+        </w:tc>
+      </w:tr>
+      <w:tr>
+        <w:tc>
+          <w:tcPr>
+            <w:tcW w:type="dxa" w:w="4939"/>
+            <w:vAlign w:val="center"/>
+          </w:tcPr>
+          <w:p>
+            <w:pPr>
+              <w:spacing w:after="0"/>
+            </w:pPr>
+            <w:r>
+              <w:rPr>
+                <w:rFonts w:ascii="Microsoft YaHei" w:hAnsi="Microsoft YaHei" w:eastAsia="Microsoft YaHei"/>
+                <w:b/>
+                <w:sz w:val="18"/>
+              </w:rPr>
+              <w:t>下一批</w:t>
+            </w:r>
+          </w:p>
+        </w:tc>
+        <w:tc>
+          <w:tcPr>
+            <w:tcW w:type="dxa" w:w="4939"/>
+            <w:vAlign w:val="center"/>
+          </w:tcPr>
+          <w:p>
+            <w:pPr>
+              <w:spacing w:after="0"/>
+            </w:pPr>
+            <w:r>
+              <w:rPr>
+                <w:rFonts w:ascii="Microsoft YaHei" w:hAnsi="Microsoft YaHei" w:eastAsia="Microsoft YaHei"/>
+                <w:b w:val="0"/>
+                <w:sz w:val="18"/>
+              </w:rPr>
+              <w:t>进入 Studio S2.1：SQLite Schema、事务、初始化、备份/损坏保护和 JSON 只读迁移入口。</w:t>
+            </w:r>
+          </w:p>
+        </w:tc>
+      </w:tr>
+    </w:tbl>
+    <w:p>
+      <w:pPr>
+        <w:spacing w:after="120"/>
+      </w:pPr>
+      <w:r>
+        <w:rPr>
+          <w:rFonts w:ascii="Microsoft YaHei" w:hAnsi="Microsoft YaHei" w:eastAsia="Microsoft YaHei"/>
+        </w:rPr>
+        <w:t>提交边界：只提交 S1.5 业务代码、对应测试和本次更新的当前研发文档；不得夹带数据集、权重、训练产物、日志、凭据、本机业务路径或无关工作区改动。</w:t>
+      </w:r>
     </w:p>
     <w:sectPr>
       <w:headerReference w:type="default" r:id="rId9"/>

</xml_diff>

<commit_message>
docs: clarify S2 through S3 schedule and sequencing
</commit_message>
<xml_diff>
--- a/docs/Auto-Tune后续研发路线与实施评估_研发执行版_20260824.docx
+++ b/docs/Auto-Tune后续研发路线与实施评估_研发执行版_20260824.docx
@@ -230,7 +230,7 @@
                 <w:b w:val="0"/>
                 <w:sz w:val="18"/>
               </w:rPr>
-              <w:t>Auto-Tune Studio v0.2；S1.2/S1.3 已通过 PR #4 合并 main；S1.4 已通过 PR #5 合并 main；S1.5 已验收待提交</w:t>
+              <w:t>Auto-Tune Studio v0.2；S1.2/S1.3 已通过 PR #4 合并 main；S1.4 已通过 PR #5 合并 main；S1.5 已推送待合并</w:t>
             </w:r>
           </w:p>
         </w:tc>
@@ -2396,7 +2396,7 @@
                 <w:b w:val="0"/>
                 <w:sz w:val="18"/>
               </w:rPr>
-              <w:t>已完成/待提交</w:t>
+              <w:t>已验收/已推送</w:t>
             </w:r>
           </w:p>
         </w:tc>
@@ -15376,6 +15376,475 @@
           <w:rFonts w:ascii="Microsoft YaHei" w:hAnsi="Microsoft YaHei" w:eastAsia="Microsoft YaHei"/>
         </w:rPr>
         <w:t>提交边界：只提交 S1.5 业务代码、对应测试和本次更新的当前研发文档；不得夹带数据集、权重、训练产物、日志、凭据、本机业务路径或无关工作区改动。</w:t>
+      </w:r>
+    </w:p>
+    <w:p>
+      <w:r>
+        <w:br w:type="page"/>
+      </w:r>
+    </w:p>
+    <w:p>
+      <w:pPr>
+        <w:pStyle w:val="Heading1"/>
+        <w:spacing w:after="240"/>
+      </w:pPr>
+      <w:r>
+        <w:rPr>
+          <w:rFonts w:ascii="Microsoft YaHei" w:hAnsi="Microsoft YaHei" w:eastAsia="Microsoft YaHei"/>
+        </w:rPr>
+        <w:t>15. 近期主线工期与顺序确认（2026-08-26）</w:t>
+      </w:r>
+    </w:p>
+    <w:p>
+      <w:pPr>
+        <w:spacing w:after="200"/>
+      </w:pPr>
+      <w:r>
+        <w:rPr>
+          <w:rFonts w:ascii="Microsoft YaHei" w:hAnsi="Microsoft YaHei" w:eastAsia="Microsoft YaHei"/>
+          <w:b/>
+          <w:sz w:val="22"/>
+        </w:rPr>
+        <w:t>结论：Studio 当前主线按 S2 → S2.5 → S3 推进，合计初步约 26–50 人日。</w:t>
+      </w:r>
+    </w:p>
+    <w:tbl>
+      <w:tblPr>
+        <w:tblStyle w:val="TableGrid"/>
+        <w:tblW w:type="auto" w:w="0"/>
+        <w:tblLayout w:type="fixed"/>
+        <w:tblLook w:firstColumn="1" w:firstRow="1" w:lastColumn="0" w:lastRow="0" w:noHBand="0" w:noVBand="1" w:val="04A0"/>
+      </w:tblPr>
+      <w:tblGrid>
+        <w:gridCol w:w="3293"/>
+        <w:gridCol w:w="3293"/>
+        <w:gridCol w:w="3293"/>
+      </w:tblGrid>
+      <w:tr>
+        <w:tc>
+          <w:tcPr>
+            <w:tcW w:type="dxa" w:w="1800"/>
+            <w:shd w:fill="D9E5F3"/>
+            <w:vAlign w:val="center"/>
+          </w:tcPr>
+          <w:p>
+            <w:pPr>
+              <w:spacing w:before="40" w:after="40" w:line="276" w:lineRule="auto"/>
+              <w:jc w:val="center"/>
+            </w:pPr>
+            <w:r/>
+            <w:r>
+              <w:rPr>
+                <w:rFonts w:ascii="Microsoft YaHei" w:hAnsi="Microsoft YaHei" w:eastAsia="Microsoft YaHei"/>
+                <w:b/>
+                <w:color w:val="1F497D"/>
+                <w:sz w:val="21"/>
+              </w:rPr>
+              <w:t>阶段</w:t>
+            </w:r>
+          </w:p>
+        </w:tc>
+        <w:tc>
+          <w:tcPr>
+            <w:tcW w:type="dxa" w:w="1512"/>
+            <w:shd w:fill="D9E5F3"/>
+            <w:vAlign w:val="center"/>
+          </w:tcPr>
+          <w:p>
+            <w:pPr>
+              <w:spacing w:before="40" w:after="40" w:line="276" w:lineRule="auto"/>
+              <w:jc w:val="center"/>
+            </w:pPr>
+            <w:r/>
+            <w:r>
+              <w:rPr>
+                <w:rFonts w:ascii="Microsoft YaHei" w:hAnsi="Microsoft YaHei" w:eastAsia="Microsoft YaHei"/>
+                <w:b/>
+                <w:color w:val="1F497D"/>
+                <w:sz w:val="21"/>
+              </w:rPr>
+              <w:t>初步人日</w:t>
+            </w:r>
+          </w:p>
+        </w:tc>
+        <w:tc>
+          <w:tcPr>
+            <w:tcW w:type="dxa" w:w="6048"/>
+            <w:shd w:fill="D9E5F3"/>
+            <w:vAlign w:val="center"/>
+          </w:tcPr>
+          <w:p>
+            <w:pPr>
+              <w:spacing w:before="40" w:after="40" w:line="276" w:lineRule="auto"/>
+              <w:jc w:val="center"/>
+            </w:pPr>
+            <w:r/>
+            <w:r>
+              <w:rPr>
+                <w:rFonts w:ascii="Microsoft YaHei" w:hAnsi="Microsoft YaHei" w:eastAsia="Microsoft YaHei"/>
+                <w:b/>
+                <w:color w:val="1F497D"/>
+                <w:sz w:val="21"/>
+              </w:rPr>
+              <w:t>进入条件与完成重点</w:t>
+            </w:r>
+          </w:p>
+        </w:tc>
+      </w:tr>
+      <w:tr>
+        <w:tc>
+          <w:tcPr>
+            <w:tcW w:type="dxa" w:w="1800"/>
+            <w:vAlign w:val="center"/>
+          </w:tcPr>
+          <w:p>
+            <w:pPr>
+              <w:spacing w:before="40" w:after="40" w:line="276" w:lineRule="auto"/>
+              <w:jc w:val="center"/>
+            </w:pPr>
+            <w:r/>
+            <w:r>
+              <w:rPr>
+                <w:rFonts w:ascii="Microsoft YaHei" w:hAnsi="Microsoft YaHei" w:eastAsia="Microsoft YaHei"/>
+                <w:b w:val="0"/>
+                <w:sz w:val="21"/>
+              </w:rPr>
+              <w:t>S2</w:t>
+            </w:r>
+          </w:p>
+        </w:tc>
+        <w:tc>
+          <w:tcPr>
+            <w:tcW w:type="dxa" w:w="1512"/>
+            <w:vAlign w:val="center"/>
+          </w:tcPr>
+          <w:p>
+            <w:pPr>
+              <w:spacing w:before="40" w:after="40" w:line="276" w:lineRule="auto"/>
+              <w:jc w:val="center"/>
+            </w:pPr>
+            <w:r/>
+            <w:r>
+              <w:rPr>
+                <w:rFonts w:ascii="Microsoft YaHei" w:hAnsi="Microsoft YaHei" w:eastAsia="Microsoft YaHei"/>
+                <w:b w:val="0"/>
+                <w:sz w:val="21"/>
+              </w:rPr>
+              <w:t>6–12</w:t>
+            </w:r>
+          </w:p>
+        </w:tc>
+        <w:tc>
+          <w:tcPr>
+            <w:tcW w:type="dxa" w:w="6048"/>
+            <w:vAlign w:val="center"/>
+          </w:tcPr>
+          <w:p>
+            <w:pPr>
+              <w:spacing w:before="40" w:after="40" w:line="276" w:lineRule="auto"/>
+              <w:jc w:val="left"/>
+            </w:pPr>
+            <w:r/>
+            <w:r>
+              <w:rPr>
+                <w:rFonts w:ascii="Microsoft YaHei" w:hAnsi="Microsoft YaHei" w:eastAsia="Microsoft YaHei"/>
+                <w:b w:val="0"/>
+                <w:sz w:val="21"/>
+              </w:rPr>
+              <w:t>先冻结 SQLite Schema、事务、备份/损坏保护和 JSON 迁移，再完成数据集、实验、报告及 UI 索引。</w:t>
+            </w:r>
+          </w:p>
+        </w:tc>
+      </w:tr>
+      <w:tr>
+        <w:tc>
+          <w:tcPr>
+            <w:tcW w:type="dxa" w:w="1800"/>
+            <w:vAlign w:val="center"/>
+          </w:tcPr>
+          <w:p>
+            <w:pPr>
+              <w:spacing w:before="40" w:after="40" w:line="276" w:lineRule="auto"/>
+              <w:jc w:val="center"/>
+            </w:pPr>
+            <w:r/>
+            <w:r>
+              <w:rPr>
+                <w:rFonts w:ascii="Microsoft YaHei" w:hAnsi="Microsoft YaHei" w:eastAsia="Microsoft YaHei"/>
+                <w:b w:val="0"/>
+                <w:sz w:val="21"/>
+              </w:rPr>
+              <w:t>S2.5</w:t>
+            </w:r>
+          </w:p>
+        </w:tc>
+        <w:tc>
+          <w:tcPr>
+            <w:tcW w:type="dxa" w:w="1512"/>
+            <w:vAlign w:val="center"/>
+          </w:tcPr>
+          <w:p>
+            <w:pPr>
+              <w:spacing w:before="40" w:after="40" w:line="276" w:lineRule="auto"/>
+              <w:jc w:val="center"/>
+            </w:pPr>
+            <w:r/>
+            <w:r>
+              <w:rPr>
+                <w:rFonts w:ascii="Microsoft YaHei" w:hAnsi="Microsoft YaHei" w:eastAsia="Microsoft YaHei"/>
+                <w:b w:val="0"/>
+                <w:sz w:val="21"/>
+              </w:rPr>
+              <w:t>10–18</w:t>
+            </w:r>
+          </w:p>
+        </w:tc>
+        <w:tc>
+          <w:tcPr>
+            <w:tcW w:type="dxa" w:w="6048"/>
+            <w:vAlign w:val="center"/>
+          </w:tcPr>
+          <w:p>
+            <w:pPr>
+              <w:spacing w:before="40" w:after="40" w:line="276" w:lineRule="auto"/>
+              <w:jc w:val="left"/>
+            </w:pPr>
+            <w:r/>
+            <w:r>
+              <w:rPr>
+                <w:rFonts w:ascii="Microsoft YaHei" w:hAnsi="Microsoft YaHei" w:eastAsia="Microsoft YaHei"/>
+                <w:b w:val="0"/>
+                <w:sz w:val="21"/>
+              </w:rPr>
+              <w:t>S2 稳定后，完成 YOLOv8 Detect、YOLOv8 Classify、YOLOv5 Detect 的真实短训练与产品闭环。</w:t>
+            </w:r>
+          </w:p>
+        </w:tc>
+      </w:tr>
+      <w:tr>
+        <w:tc>
+          <w:tcPr>
+            <w:tcW w:type="dxa" w:w="1800"/>
+            <w:vAlign w:val="center"/>
+          </w:tcPr>
+          <w:p>
+            <w:pPr>
+              <w:spacing w:before="40" w:after="40" w:line="276" w:lineRule="auto"/>
+              <w:jc w:val="center"/>
+            </w:pPr>
+            <w:r/>
+            <w:r>
+              <w:rPr>
+                <w:rFonts w:ascii="Microsoft YaHei" w:hAnsi="Microsoft YaHei" w:eastAsia="Microsoft YaHei"/>
+                <w:b w:val="0"/>
+                <w:sz w:val="21"/>
+              </w:rPr>
+              <w:t>S3</w:t>
+            </w:r>
+          </w:p>
+        </w:tc>
+        <w:tc>
+          <w:tcPr>
+            <w:tcW w:type="dxa" w:w="1512"/>
+            <w:vAlign w:val="center"/>
+          </w:tcPr>
+          <w:p>
+            <w:pPr>
+              <w:spacing w:before="40" w:after="40" w:line="276" w:lineRule="auto"/>
+              <w:jc w:val="center"/>
+            </w:pPr>
+            <w:r/>
+            <w:r>
+              <w:rPr>
+                <w:rFonts w:ascii="Microsoft YaHei" w:hAnsi="Microsoft YaHei" w:eastAsia="Microsoft YaHei"/>
+                <w:b w:val="0"/>
+                <w:sz w:val="21"/>
+              </w:rPr>
+              <w:t>10–20</w:t>
+            </w:r>
+          </w:p>
+        </w:tc>
+        <w:tc>
+          <w:tcPr>
+            <w:tcW w:type="dxa" w:w="6048"/>
+            <w:vAlign w:val="center"/>
+          </w:tcPr>
+          <w:p>
+            <w:pPr>
+              <w:spacing w:before="40" w:after="40" w:line="276" w:lineRule="auto"/>
+              <w:jc w:val="left"/>
+            </w:pPr>
+            <w:r/>
+            <w:r>
+              <w:rPr>
+                <w:rFonts w:ascii="Microsoft YaHei" w:hAnsi="Microsoft YaHei" w:eastAsia="Microsoft YaHei"/>
+                <w:b w:val="0"/>
+                <w:sz w:val="21"/>
+              </w:rPr>
+              <w:t>S2.5 完成后，围绕已冻结的数据库、配置、持久化目录和任务依赖完成 Linux、Docker、原生安装与升级回退。</w:t>
+            </w:r>
+          </w:p>
+        </w:tc>
+      </w:tr>
+      <w:tr>
+        <w:tc>
+          <w:tcPr>
+            <w:tcW w:type="dxa" w:w="1800"/>
+            <w:vAlign w:val="center"/>
+            <w:shd w:fill="E2F0D9"/>
+          </w:tcPr>
+          <w:p>
+            <w:pPr>
+              <w:spacing w:before="40" w:after="40" w:line="276" w:lineRule="auto"/>
+              <w:jc w:val="center"/>
+            </w:pPr>
+            <w:r/>
+            <w:r>
+              <w:rPr>
+                <w:rFonts w:ascii="Microsoft YaHei" w:hAnsi="Microsoft YaHei" w:eastAsia="Microsoft YaHei"/>
+                <w:b/>
+                <w:sz w:val="21"/>
+              </w:rPr>
+              <w:t>合计</w:t>
+            </w:r>
+          </w:p>
+        </w:tc>
+        <w:tc>
+          <w:tcPr>
+            <w:tcW w:type="dxa" w:w="1512"/>
+            <w:vAlign w:val="center"/>
+            <w:shd w:fill="E2F0D9"/>
+          </w:tcPr>
+          <w:p>
+            <w:pPr>
+              <w:spacing w:before="40" w:after="40" w:line="276" w:lineRule="auto"/>
+              <w:jc w:val="center"/>
+            </w:pPr>
+            <w:r/>
+            <w:r>
+              <w:rPr>
+                <w:rFonts w:ascii="Microsoft YaHei" w:hAnsi="Microsoft YaHei" w:eastAsia="Microsoft YaHei"/>
+                <w:b/>
+                <w:sz w:val="21"/>
+              </w:rPr>
+              <w:t>26–50</w:t>
+            </w:r>
+          </w:p>
+        </w:tc>
+        <w:tc>
+          <w:tcPr>
+            <w:tcW w:type="dxa" w:w="6048"/>
+            <w:vAlign w:val="center"/>
+            <w:shd w:fill="E2F0D9"/>
+          </w:tcPr>
+          <w:p>
+            <w:pPr>
+              <w:spacing w:before="40" w:after="40" w:line="276" w:lineRule="auto"/>
+              <w:jc w:val="left"/>
+            </w:pPr>
+            <w:r/>
+            <w:r>
+              <w:rPr>
+                <w:rFonts w:ascii="Microsoft YaHei" w:hAnsi="Microsoft YaHei" w:eastAsia="Microsoft YaHei"/>
+                <w:b/>
+                <w:sz w:val="21"/>
+              </w:rPr>
+              <w:t>不包含真实环境准备、返工和发布试装；单人连续开发约 5–10 周。</w:t>
+            </w:r>
+          </w:p>
+        </w:tc>
+      </w:tr>
+    </w:tbl>
+    <w:p>
+      <w:pPr>
+        <w:spacing w:before="200" w:after="80"/>
+      </w:pPr>
+      <w:r>
+        <w:rPr>
+          <w:b/>
+          <w:color w:val="1F497D"/>
+          <w:sz w:val="22"/>
+        </w:rPr>
+        <w:t>顺序依据</w:t>
+      </w:r>
+    </w:p>
+    <w:p>
+      <w:pPr>
+        <w:pStyle w:val="ListNumber"/>
+        <w:spacing w:after="60"/>
+      </w:pPr>
+      <w:r>
+        <w:t>S2 是后续历史、报告和产物的存储基础；先完成可避免 S2.5 继续围绕旧 JSON 开发后再次迁移。</w:t>
+      </w:r>
+    </w:p>
+    <w:p>
+      <w:pPr>
+        <w:pStyle w:val="ListNumber"/>
+        <w:spacing w:after="60"/>
+      </w:pPr>
+      <w:r>
+        <w:t>S2.5 必须先于 S3，使安装和升级验收覆盖最终支持的三项任务，避免任务扩展后重新制作镜像和安装包。</w:t>
+      </w:r>
+    </w:p>
+    <w:p>
+      <w:pPr>
+        <w:pStyle w:val="ListNumber"/>
+        <w:spacing w:after="60"/>
+      </w:pPr>
+      <w:r>
+        <w:t>S3 最后冻结并交付单实例部署；Docker 化不扩张为 Cloud 的多用户、队列或 GPU 调度。</w:t>
+      </w:r>
+    </w:p>
+    <w:p>
+      <w:pPr>
+        <w:spacing w:before="160" w:after="80"/>
+      </w:pPr>
+      <w:r>
+        <w:rPr>
+          <w:b/>
+          <w:color w:val="1F497D"/>
+          <w:sz w:val="22"/>
+        </w:rPr>
+        <w:t>可提前并行准备</w:t>
+      </w:r>
+    </w:p>
+    <w:p>
+      <w:pPr>
+        <w:pStyle w:val="ListBullet"/>
+        <w:spacing w:after="60"/>
+      </w:pPr>
+      <w:r>
+        <w:t>Ubuntu Server、Docker、NVIDIA Container Toolkit、测试 GPU 与 SSH 环境。</w:t>
+      </w:r>
+    </w:p>
+    <w:p>
+      <w:pPr>
+        <w:pStyle w:val="ListBullet"/>
+        <w:spacing w:after="60"/>
+      </w:pPr>
+      <w:r>
+        <w:t>联网/离线依赖、SQLite/数据集/权重/日志/报告挂载目录和升级备份演练。</w:t>
+      </w:r>
+    </w:p>
+    <w:p>
+      <w:pPr>
+        <w:pStyle w:val="ListBullet"/>
+        <w:spacing w:after="60"/>
+      </w:pPr>
+      <w:r>
+        <w:t>YOLOv8 Classify、YOLOv5 Detect 最小合法数据及 Linux Secret 只读文件方案。</w:t>
+      </w:r>
+    </w:p>
+    <w:p>
+      <w:pPr>
+        <w:spacing w:before="160" w:after="0"/>
+      </w:pPr>
+      <w:r>
+        <w:rPr>
+          <w:b/>
+          <w:sz w:val="21"/>
+        </w:rPr>
+        <w:t>边界：上述准备工作不授权提前冻结安装包、跳过 S2/S2.5 验收或扩展当前产品任务范围。</w:t>
       </w:r>
     </w:p>
     <w:sectPr>

</xml_diff>